<commit_message>
Changed LEAP to Leap
</commit_message>
<xml_diff>
--- a/kickoff/LEAP-Project-Business-Requirements-Specification.docx
+++ b/kickoff/LEAP-Project-Business-Requirements-Specification.docx
@@ -13,7 +13,7 @@
           <w:color w:val="595959"/>
           <w:sz w:val="32"/>
         </w:rPr>
-        <w:t>LEAP PROJECT</w:t>
+        <w:t>Leap PROJECT</w:t>
       </w:r>
     </w:p>
     <w:p>
@@ -119,7 +119,7 @@
                 <w:b w:val="0"/>
                 <w:sz w:val="20"/>
               </w:rPr>
-              <w:t>LEAP-BRS-2026-014</w:t>
+              <w:t>Leap-BRS-2026-014</w:t>
             </w:r>
           </w:p>
         </w:tc>
@@ -649,7 +649,7 @@
     </w:p>
     <w:p>
       <w:r>
-        <w:t>This document sets out the business requirements for the LEAP Project, a direct-to-consumer trading platform. It describes what the business needs the platform to do and the standard of service it must meet. It does not prescribe how the platform should be built.</w:t>
+        <w:t>This document sets out the business requirements for the Leap Project, a direct-to-consumer trading platform. It describes what the business needs the platform to do and the standard of service it must meet. It does not prescribe how the platform should be built.</w:t>
       </w:r>
     </w:p>
     <w:p>
@@ -3117,7 +3117,7 @@
         <w:color w:val="595959"/>
         <w:sz w:val="16"/>
       </w:rPr>
-      <w:t>LEAP-BRS-2026-014  |  Version 0.9  –  Draft for Delivery Partner Response</w:t>
+      <w:t>Leap-BRS-2026-014  |  Version 0.9  –  Draft for Delivery Partner Response</w:t>
     </w:r>
   </w:p>
 </w:ftr>
@@ -3135,7 +3135,7 @@
         <w:color w:val="595959"/>
         <w:sz w:val="16"/>
       </w:rPr>
-      <w:t>LEAP Project  |  Confidential  –  Delivery Partner Distribution Only</w:t>
+      <w:t>Leap Project  |  Confidential  –  Delivery Partner Distribution Only</w:t>
     </w:r>
   </w:p>
 </w:hdr>

</xml_diff>